<commit_message>
cession: validation, auto-calc, DOCX templates, overwrite confirm, date format
- Step 1 capital validation with session-preserved error state
- Step 2 parts/capital detenu auto-calc and validation with CSS error classes
- Step 3 cessionnaire auto-fill (parts/capital from parts_cedees), number_format fix
- Step 6 overwrite confirmation for existing generated documents, redirect with id
- All 4 DOCX templates updated: full cedant/cessionnaire info, compact layout, merged paragraphs
- Date format DD/MM/YYYY via fmtDate helper in buildContextFromCession()
- Added SOCIETE_TP, SOCIETE_CNSS to context keys
- router.php for PHP built-in server static file serving
</commit_message>
<xml_diff>
--- a/templates/_Cession/Annonce-Legale-Cession_Template.docx
+++ b/templates/_Cession/Annonce-Legale-Cession_Template.docx
@@ -15,7 +15,7 @@
           <w:b/>
           <w:sz w:val="28"/>
         </w:rPr>
-        <w:t>ANNONCE LEGALE - CESSION DE PARTS</w:t>
+        <w:t>ANNONCE LEGALE - CESSION DE PARTS SOCIALES</w:t>
       </w:r>
     </w:p>
     <w:p>
@@ -44,7 +44,7 @@
         <w:rPr>
           <w:sz w:val="22"/>
         </w:rPr>
-        <w:t>CESSION DE PARTS SOCIALES</w:t>
+        <w:t/>
       </w:r>
     </w:p>
     <w:p>
@@ -76,7 +76,7 @@
         <w:rPr>
           <w:sz w:val="22"/>
         </w:rPr>
-        <w:t>Capital social : {{ SOCIETE_CAPITAL }} DH</w:t>
+        <w:t>Capital social : {{ SOCIETE_CAPITAL }} DHS</w:t>
       </w:r>
     </w:p>
     <w:p>
@@ -116,31 +116,31 @@
         <w:rPr>
           <w:sz w:val="22"/>
         </w:rPr>
-        <w:t>Aux termes d'un acte en date du {{ CESSION_DATE }},</w:t>
-      </w:r>
-    </w:p>
-    <w:p>
-      <w:r>
-        <w:rPr>
-          <w:sz w:val="22"/>
-        </w:rPr>
-        <w:t>{{ CEDANT_NOM_COMPLET }} a cede a {{ CESSIONNAIRE_NOM_COMPLET }}</w:t>
-      </w:r>
-    </w:p>
-    <w:p>
-      <w:r>
-        <w:rPr>
-          <w:sz w:val="22"/>
-        </w:rPr>
-        <w:t>{{ PARTS_CEDEES }} parts sociales de la societe sus-designee,</w:t>
-      </w:r>
-    </w:p>
-    <w:p>
-      <w:r>
-        <w:rPr>
-          <w:sz w:val="22"/>
-        </w:rPr>
-        <w:t>pour un montant de {{ PRIX_TOTAL }} DH.</w:t>
+        <w:t>Aux termes d'un acte en date du {{ CESSION_DATE }}, {{ CEDANT_NOM_COMPLET }} a cede a {{ CESSIONNAIRE_NOM_COMPLET }} {{ PARTS_CEDEES }} parts sociales de la societe sus-designee, pour un montant de {{ PRIX_TOTAL }} DHS.</w:t>
+      </w:r>
+    </w:p>
+    <w:p>
+      <w:r>
+        <w:rPr>
+          <w:sz w:val="22"/>
+        </w:rPr>
+        <w:t>Le capital social est divise en {{ SOCIETE_PART_SOCIAL }} parts de {{ SOCIETE_VALEUR_NOMINALE }} DHS chacune.</w:t>
+      </w:r>
+    </w:p>
+    <w:p>
+      <w:r>
+        <w:rPr>
+          <w:sz w:val="22"/>
+        </w:rPr>
+        <w:t/>
+      </w:r>
+    </w:p>
+    <w:p>
+      <w:r>
+        <w:rPr>
+          <w:sz w:val="22"/>
+        </w:rPr>
+        <w:t/>
       </w:r>
     </w:p>
     <w:p>

</xml_diff>